<commit_message>
repro: equalize signature lines to 32 underscores (fit on one line)
</commit_message>
<xml_diff>
--- a/repros/signature-block-variants.docx
+++ b/repros/signature-block-variants.docx
@@ -89,21 +89,21 @@
           <w:rFonts w:ascii="Times New Roman" w:hAnsi="Times New Roman"/>
           <w:sz w:val="24"/>
         </w:rPr>
-        <w:t xml:space="preserve">__________________________________</w:t>
-      </w:r>
-      <w:r>
-        <w:rPr>
-          <w:rFonts w:ascii="Times New Roman" w:hAnsi="Times New Roman"/>
-          <w:sz w:val="24"/>
-        </w:rPr>
-        <w:tab/>
-      </w:r>
-      <w:r>
-        <w:rPr>
-          <w:rFonts w:ascii="Times New Roman" w:hAnsi="Times New Roman"/>
-          <w:sz w:val="24"/>
-        </w:rPr>
-        <w:t xml:space="preserve">__________________________________</w:t>
+        <w:t xml:space="preserve">________________________________</w:t>
+      </w:r>
+      <w:r>
+        <w:rPr>
+          <w:rFonts w:ascii="Times New Roman" w:hAnsi="Times New Roman"/>
+          <w:sz w:val="24"/>
+        </w:rPr>
+        <w:tab/>
+      </w:r>
+      <w:r>
+        <w:rPr>
+          <w:rFonts w:ascii="Times New Roman" w:hAnsi="Times New Roman"/>
+          <w:sz w:val="24"/>
+        </w:rPr>
+        <w:t xml:space="preserve">________________________________</w:t>
       </w:r>
     </w:p>
     <w:p>
@@ -199,7 +199,7 @@
                 <w:rFonts w:ascii="Times New Roman" w:hAnsi="Times New Roman"/>
                 <w:sz w:val="24"/>
               </w:rPr>
-              <w:t xml:space="preserve">__________________________________</w:t>
+              <w:t xml:space="preserve">________________________________</w:t>
             </w:r>
           </w:p>
           <w:p>
@@ -252,7 +252,7 @@
                 <w:rFonts w:ascii="Times New Roman" w:hAnsi="Times New Roman"/>
                 <w:sz w:val="24"/>
               </w:rPr>
-              <w:t xml:space="preserve">__________________________________</w:t>
+              <w:t xml:space="preserve">________________________________</w:t>
             </w:r>
           </w:p>
           <w:p>
@@ -352,21 +352,21 @@
           <w:rFonts w:ascii="Times New Roman" w:hAnsi="Times New Roman"/>
           <w:sz w:val="24"/>
         </w:rPr>
-        <w:t xml:space="preserve">__________________________________</w:t>
-      </w:r>
-      <w:r>
-        <w:rPr>
-          <w:rFonts w:ascii="Times New Roman" w:hAnsi="Times New Roman"/>
-          <w:sz w:val="24"/>
-        </w:rPr>
-        <w:tab/>
-      </w:r>
-      <w:r>
-        <w:rPr>
-          <w:rFonts w:ascii="Times New Roman" w:hAnsi="Times New Roman"/>
-          <w:sz w:val="24"/>
-        </w:rPr>
-        <w:t xml:space="preserve">__________________________________</w:t>
+        <w:t xml:space="preserve">________________________________</w:t>
+      </w:r>
+      <w:r>
+        <w:rPr>
+          <w:rFonts w:ascii="Times New Roman" w:hAnsi="Times New Roman"/>
+          <w:sz w:val="24"/>
+        </w:rPr>
+        <w:tab/>
+      </w:r>
+      <w:r>
+        <w:rPr>
+          <w:rFonts w:ascii="Times New Roman" w:hAnsi="Times New Roman"/>
+          <w:sz w:val="24"/>
+        </w:rPr>
+        <w:t xml:space="preserve">________________________________</w:t>
       </w:r>
     </w:p>
     <w:p>
@@ -486,21 +486,21 @@
           <w:rFonts w:ascii="Times New Roman" w:hAnsi="Times New Roman"/>
           <w:sz w:val="24"/>
         </w:rPr>
-        <w:t xml:space="preserve">__________________________________</w:t>
-      </w:r>
-      <w:r>
-        <w:rPr>
-          <w:rFonts w:ascii="Times New Roman" w:hAnsi="Times New Roman"/>
-          <w:sz w:val="24"/>
-        </w:rPr>
-        <w:tab/>
-      </w:r>
-      <w:r>
-        <w:rPr>
-          <w:rFonts w:ascii="Times New Roman" w:hAnsi="Times New Roman"/>
-          <w:sz w:val="24"/>
-        </w:rPr>
-        <w:t xml:space="preserve">__________________________________</w:t>
+        <w:t xml:space="preserve">________________________________</w:t>
+      </w:r>
+      <w:r>
+        <w:rPr>
+          <w:rFonts w:ascii="Times New Roman" w:hAnsi="Times New Roman"/>
+          <w:sz w:val="24"/>
+        </w:rPr>
+        <w:tab/>
+      </w:r>
+      <w:r>
+        <w:rPr>
+          <w:rFonts w:ascii="Times New Roman" w:hAnsi="Times New Roman"/>
+          <w:sz w:val="24"/>
+        </w:rPr>
+        <w:t xml:space="preserve">________________________________</w:t>
       </w:r>
     </w:p>
     <w:p>

</xml_diff>

<commit_message>
repro: add styles.xml (docDefaults spacing) so extend matches Word
The hand-built docx had no styles.xml, so Word applied its app-default
paragraph spacing while extend rendered the file's literal zero spacing.
Adding docDefaults (8pt after, 1.08 line, Times New Roman) makes the
fixture well-formed; extend honors docDefaults spacing and now matches.
</commit_message>
<xml_diff>
--- a/repros/signature-block-variants.docx
+++ b/repros/signature-block-variants.docx
@@ -539,4 +539,27 @@
     </w:sectPr>
   </w:body>
 </w:document>
+</file>
+
+<file path=word/styles.xml><?xml version="1.0" encoding="utf-8"?>
+<w:styles xmlns:w="http://schemas.openxmlformats.org/wordprocessingml/2006/main">
+  <w:docDefaults>
+    <w:rPrDefault>
+      <w:rPr>
+        <w:rFonts w:ascii="Times New Roman" w:hAnsi="Times New Roman" w:cs="Times New Roman"/>
+        <w:sz w:val="24"/>
+        <w:szCs w:val="24"/>
+      </w:rPr>
+    </w:rPrDefault>
+    <w:pPrDefault>
+      <w:pPr>
+        <w:spacing w:after="160" w:line="259" w:lineRule="auto"/>
+      </w:pPr>
+    </w:pPrDefault>
+  </w:docDefaults>
+  <w:style w:type="paragraph" w:default="1" w:styleId="Normal">
+    <w:name w:val="Normal"/>
+    <w:qFormat/>
+  </w:style>
+</w:styles>
 </file>
</xml_diff>

<commit_message>
repro: add Variant E (left+right tabs, NO line break / wrap-dependent)
Mirrors the real McKinsey signature block: the right column's two lines
are one continuous run (space, no <w:br/>) relying on wrap-to-margin, plus
a second right-tab segment. This is the case the left-right grid mishandles
(doubles the trailer) while plain flow renders correctly.
</commit_message>
<xml_diff>
--- a/repros/signature-block-variants.docx
+++ b/repros/signature-block-variants.docx
@@ -532,6 +532,128 @@
         <w:t xml:space="preserve">Name:  </w:t>
       </w:r>
     </w:p>
+    <w:p>
+      <w:pPr>
+        <w:spacing w:after="0"/>
+      </w:pPr>
+      <w:r>
+        <w:rPr>
+          <w:sz w:val="24"/>
+          <w:b/>
+        </w:rPr>
+        <w:t xml:space="preserve">Variant E: left + right tab stops, NO line break (wrap-dependent)</w:t>
+      </w:r>
+    </w:p>
+    <w:p>
+      <w:pPr>
+        <w:tabs>
+          <w:tab w:val="left" w:pos="5760"/>
+          <w:tab w:val="right" w:pos="9240"/>
+        </w:tabs>
+        <w:spacing w:after="0"/>
+      </w:pPr>
+      <w:r>
+        <w:rPr>
+          <w:sz w:val="24"/>
+        </w:rPr>
+        <w:t xml:space="preserve">Client A</w:t>
+      </w:r>
+      <w:r>
+        <w:rPr>
+          <w:sz w:val="24"/>
+        </w:rPr>
+        <w:tab/>
+      </w:r>
+      <w:r>
+        <w:rPr>
+          <w:sz w:val="24"/>
+        </w:rPr>
+        <w:t xml:space="preserve">Company B Legal Name LLC</w:t>
+      </w:r>
+      <w:r>
+        <w:rPr>
+          <w:sz w:val="24"/>
+        </w:rPr>
+        <w:t xml:space="preserve"> </w:t>
+      </w:r>
+      <w:r>
+        <w:rPr>
+          <w:sz w:val="24"/>
+        </w:rPr>
+        <w:t xml:space="preserve">On behalf of itself and its affiliates</w:t>
+      </w:r>
+      <w:r>
+        <w:rPr>
+          <w:sz w:val="24"/>
+        </w:rPr>
+        <w:tab/>
+      </w:r>
+      <w:r>
+        <w:rPr>
+          <w:sz w:val="24"/>
+        </w:rPr>
+        <w:t xml:space="preserve">On behalf of itself and its affiliates</w:t>
+      </w:r>
+    </w:p>
+    <w:p>
+      <w:pPr>
+        <w:spacing w:after="0"/>
+      </w:pPr>
+    </w:p>
+    <w:p>
+      <w:pPr>
+        <w:tabs>
+          <w:tab w:val="left" w:pos="5760"/>
+          <w:tab w:val="right" w:pos="9240"/>
+        </w:tabs>
+        <w:spacing w:after="0"/>
+      </w:pPr>
+      <w:r>
+        <w:rPr>
+          <w:sz w:val="24"/>
+        </w:rPr>
+        <w:t xml:space="preserve">________________________________</w:t>
+      </w:r>
+      <w:r>
+        <w:rPr>
+          <w:sz w:val="24"/>
+        </w:rPr>
+        <w:tab/>
+      </w:r>
+      <w:r>
+        <w:rPr>
+          <w:sz w:val="24"/>
+        </w:rPr>
+        <w:t xml:space="preserve">________________________________</w:t>
+      </w:r>
+    </w:p>
+    <w:p>
+      <w:pPr>
+        <w:tabs>
+          <w:tab w:val="left" w:pos="5760"/>
+          <w:tab w:val="right" w:pos="9240"/>
+        </w:tabs>
+        <w:spacing w:after="0"/>
+      </w:pPr>
+      <w:r>
+        <w:rPr>
+          <w:sz w:val="24"/>
+        </w:rPr>
+        <w:t xml:space="preserve">Name:  </w:t>
+      </w:r>
+      <w:r>
+        <w:rPr>
+          <w:sz w:val="24"/>
+        </w:rPr>
+        <w:tab/>
+      </w:r>
+      <w:r>
+        <w:rPr>
+          <w:sz w:val="24"/>
+        </w:rPr>
+        <w:t xml:space="preserve">Name:  </w:t>
+      </w:r>
+    </w:p>
     <w:p/>
     <w:sectPr>
       <w:pgSz w:w="12240" w:h="15840"/>

</xml_diff>